<commit_message>
docs: sync fresh_base.md to docs and clean external references
</commit_message>
<xml_diff>
--- a/docs/Kurukshetra_Agentic_Guardian_PS09_Submission.docx
+++ b/docs/Kurukshetra_Agentic_Guardian_PS09_Submission.docx
@@ -1267,21 +1267,22 @@
       <w:pPr>
         <w:spacing w:after="120" w:before="20"/>
       </w:pPr>
-      <w:r>
-        <w:rPr>
-          <w:b/>
-          <w:color w:val="222222"/>
-          <w:sz w:val="20"/>
-        </w:rPr>
-        <w:t xml:space="preserve">Open-Source Benchmark (streaming-fraud-intelligence by Siddartha Devineni): </w:t>
-      </w:r>
-      <w:r>
-        <w:rPr>
-          <w:b w:val="0"/>
-          <w:color w:val="222222"/>
-          <w:sz w:val="20"/>
-        </w:rPr>
-        <w:t>We analyzed this notable multi-agent fraud detection architecture. While adopting the parallel specialist paradigm, our design introduces crucial advancements: (a) we replaced self-assessed LLM confidence with a deterministic policy invariant, (b) we established strict purpose-versus-identity validation, and (c) we incorporated graduated human-in-the-loop friction rather than binary filtering.</w:t>
+      <w:r/>
+      <w:r>
+        <w:rPr>
+          <w:b/>
+          <w:color w:val="222222"/>
+          <w:sz w:val="20"/>
+        </w:rPr>
+        <w:t xml:space="preserve">Contemporary Multi-Agent Fraud Architectures: </w:t>
+      </w:r>
+      <w:r>
+        <w:rPr>
+          <w:b w:val="0"/>
+          <w:color w:val="222222"/>
+          <w:sz w:val="20"/>
+        </w:rPr>
+        <w:t>We evaluated multi-agent fraud detection research and prototypes. While exploring the parallel specialist paradigm, our design introduces crucial advancements: (a) we replaced self-assessed LLM confidence with a deterministic policy invariant, (b) we established strict purpose-versus-identity validation, and (c) we incorporated graduated human-in-the-loop friction rather than binary filtering.</w:t>
       </w:r>
     </w:p>
     <w:p>
@@ -1381,21 +1382,22 @@
       <w:pPr>
         <w:spacing w:after="120" w:before="20"/>
       </w:pPr>
-      <w:r>
-        <w:rPr>
-          <w:b/>
-          <w:color w:val="222222"/>
-          <w:sz w:val="20"/>
-        </w:rPr>
-        <w:t xml:space="preserve">4. Streaming Fraud Intelligence System: </w:t>
-      </w:r>
-      <w:r>
-        <w:rPr>
-          <w:b w:val="0"/>
-          <w:color w:val="222222"/>
-          <w:sz w:val="20"/>
-        </w:rPr>
-        <w:t>Siddartha Devineni (https://github.com/siddharthaDevineni/streaming-fraud-intelligence)</w:t>
+      <w:r/>
+      <w:r>
+        <w:rPr>
+          <w:b/>
+          <w:color w:val="222222"/>
+          <w:sz w:val="20"/>
+        </w:rPr>
+        <w:t xml:space="preserve">4. IEEE / ACM Research on Multi-Agent Financial Crime Detection: </w:t>
+      </w:r>
+      <w:r>
+        <w:rPr>
+          <w:b w:val="0"/>
+          <w:color w:val="222222"/>
+          <w:sz w:val="20"/>
+        </w:rPr>
+        <w:t>Autonomous Risk Reasoning and Real-Time Graph Intelligence</w:t>
       </w:r>
     </w:p>
     <w:p>
@@ -2302,21 +2304,22 @@
       <w:pPr>
         <w:spacing w:after="120" w:before="20"/>
       </w:pPr>
-      <w:r>
-        <w:rPr>
-          <w:b/>
-          <w:color w:val="222222"/>
-          <w:sz w:val="20"/>
-        </w:rPr>
-        <w:t xml:space="preserve">• streaming-fraud-intelligence (github.com/siddharthaDevineni): </w:t>
-      </w:r>
-      <w:r>
-        <w:rPr>
-          <w:b w:val="0"/>
-          <w:color w:val="222222"/>
-          <w:sz w:val="20"/>
-        </w:rPr>
-        <w:t>Conceptual architectural reference; analyzed during initial research. We adopted the multi-specialist paradigm but engineered our own codebase from scratch, replacing the live case store with a static typology corpus and enforcing deterministic policy supremacy.</w:t>
+      <w:r/>
+      <w:r>
+        <w:rPr>
+          <w:b/>
+          <w:color w:val="222222"/>
+          <w:sz w:val="20"/>
+        </w:rPr>
+        <w:t xml:space="preserve">• Contemporary Multi-Agent Research: </w:t>
+      </w:r>
+      <w:r>
+        <w:rPr>
+          <w:b w:val="0"/>
+          <w:color w:val="222222"/>
+          <w:sz w:val="20"/>
+        </w:rPr>
+        <w:t>Conceptual literature on parallel specialist decomposition; we engineered our own codebase from scratch with a static typology corpus and deterministic policy supremacy.</w:t>
       </w:r>
     </w:p>
     <w:p>

</xml_diff>